<commit_message>
Added data to the event table. It is now finished with 10 rows, meeting the criteria.
</commit_message>
<xml_diff>
--- a/scenario-for-project.docx
+++ b/scenario-for-project.docx
@@ -317,6 +317,9 @@
       <w:r>
         <w:t>The database for this assignment will hold data for the different city blocks which are part of a single neighbourhood (will record more than one neighbourhood and their respective blocks) and will record the number of people infected in the city blocks for each neighbourhood. And regarding the city blocks, they will be done approximately for the sake of simplicity as doing every single New York City block would be extremely hard, and I (David) am quite tiered of the warnings of unusual traffic from google when I search for population data or anything regarding the Dollar Flu</w:t>
       </w:r>
+      <w:r>
+        <w:t>.</w:t>
+      </w:r>
     </w:p>
     <w:p>
       <w:pPr>
@@ -352,15 +355,7 @@
     </w:p>
     <w:p>
       <w:r>
-        <w:t xml:space="preserve">The first table is neighbourhood which will just </w:t>
-      </w:r>
-      <w:proofErr w:type="spellStart"/>
-      <w:r>
-        <w:t>includes</w:t>
-      </w:r>
-      <w:proofErr w:type="spellEnd"/>
-      <w:r>
-        <w:t xml:space="preserve"> neighbourhood ID(primary key) and the name of the neighbourhood. An example being Harlem.</w:t>
+        <w:t>The first table is neighbourhood which will just includes neighbourhood ID(primary key) and the name of the neighbourhood. An example being Harlem.</w:t>
       </w:r>
     </w:p>
     <w:p>
@@ -369,26 +364,16 @@
           <w:u w:val="single"/>
         </w:rPr>
       </w:pPr>
-      <w:proofErr w:type="spellStart"/>
       <w:r>
         <w:rPr>
           <w:u w:val="single"/>
         </w:rPr>
         <w:t>Cityblock</w:t>
       </w:r>
-      <w:proofErr w:type="spellEnd"/>
-    </w:p>
-    <w:p>
-      <w:r>
-        <w:t xml:space="preserve">The second table will include the ID of the </w:t>
-      </w:r>
-      <w:proofErr w:type="spellStart"/>
-      <w:r>
-        <w:t>cityblock</w:t>
-      </w:r>
-      <w:proofErr w:type="spellEnd"/>
-      <w:r>
-        <w:t xml:space="preserve">(primary key) and the neighbourhood (foreign key) the block is located in. One neighbourhood will have many city blocks. Other attributes </w:t>
+    </w:p>
+    <w:p>
+      <w:r>
+        <w:t xml:space="preserve">The second table will include the ID of the cityblock(primary key) and the neighbourhood (foreign key) the block is located in. One neighbourhood will have many city blocks. Other attributes </w:t>
       </w:r>
       <w:r>
         <w:t>include one</w:t>
@@ -412,50 +397,16 @@
           <w:u w:val="single"/>
         </w:rPr>
       </w:pPr>
-      <w:proofErr w:type="spellStart"/>
       <w:r>
         <w:rPr>
           <w:u w:val="single"/>
         </w:rPr>
         <w:t>InfectionEvent</w:t>
       </w:r>
-      <w:proofErr w:type="spellEnd"/>
-    </w:p>
-    <w:p>
-      <w:r>
-        <w:t>This table will record the details of each individual outbreak event which occurs to spread the virus. It’s attributes will include event number(</w:t>
-      </w:r>
-      <w:proofErr w:type="spellStart"/>
-      <w:r>
-        <w:t>primary_key</w:t>
-      </w:r>
-      <w:proofErr w:type="spellEnd"/>
-      <w:r>
-        <w:t xml:space="preserve">), </w:t>
-      </w:r>
-      <w:proofErr w:type="spellStart"/>
-      <w:r>
-        <w:t>block_ID</w:t>
-      </w:r>
-      <w:proofErr w:type="spellEnd"/>
-      <w:r>
-        <w:t>(</w:t>
-      </w:r>
-      <w:proofErr w:type="spellStart"/>
-      <w:r>
-        <w:t>foreign_key</w:t>
-      </w:r>
-      <w:proofErr w:type="spellEnd"/>
-      <w:r>
-        <w:t xml:space="preserve">), </w:t>
-      </w:r>
-      <w:proofErr w:type="spellStart"/>
-      <w:r>
-        <w:t>people_infected</w:t>
-      </w:r>
-      <w:proofErr w:type="spellEnd"/>
-      <w:r>
-        <w:t xml:space="preserve"> which are number of people who initially become infected at the beginning of the outbreak and a description of the outbreak and how it happened. An example being “Individuals from the original infection go about </w:t>
+    </w:p>
+    <w:p>
+      <w:r>
+        <w:t xml:space="preserve">This table will record the details of each individual outbreak event which occurs to spread the virus. It’s attributes will include event number(primary_key), block_ID(foreign_key), people_infected which are number of people who initially become infected at the beginning of the outbreak and a description of the outbreak and how it happened. An example being “Individuals from the original infection go about </w:t>
       </w:r>
       <w:r>
         <w:lastRenderedPageBreak/>
@@ -471,15 +422,7 @@
         <w:t xml:space="preserve">Note: </w:t>
       </w:r>
       <w:r>
-        <w:t xml:space="preserve">The infected count for the </w:t>
-      </w:r>
-      <w:proofErr w:type="spellStart"/>
-      <w:r>
-        <w:t>infectionevent</w:t>
-      </w:r>
-      <w:proofErr w:type="spellEnd"/>
-      <w:r>
-        <w:t xml:space="preserve"> table is different from that of the block table. The infected count for the outbreak is the base number which occurs at the beginning of that outbreak and doesn’t increase or change. The attribute for the number of people infected keeps track of the infection spreading and how that number increases. The number at the end of the simulation will be recorded onto the database.</w:t>
+        <w:t>The infected count for the infectionevent table is different from that of the block table. The infected count for the outbreak is the base number which occurs at the beginning of that outbreak and doesn’t increase or change. The attribute for the number of people infected keeps track of the infection spreading and how that number increases. The number at the end of the simulation will be recorded onto the database.</w:t>
       </w:r>
     </w:p>
     <w:p/>
@@ -530,15 +473,7 @@
     </w:p>
     <w:p>
       <w:r>
-        <w:t xml:space="preserve">“Dark Winter | Johns Hopkins </w:t>
-      </w:r>
-      <w:proofErr w:type="spellStart"/>
-      <w:r>
-        <w:t>Center</w:t>
-      </w:r>
-      <w:proofErr w:type="spellEnd"/>
-      <w:r>
-        <w:t xml:space="preserve"> for Health Security,” </w:t>
+        <w:t xml:space="preserve">“Dark Winter | Johns Hopkins Center for Health Security,” </w:t>
       </w:r>
       <w:r>
         <w:rPr>
@@ -590,15 +525,7 @@
     </w:p>
     <w:p>
       <w:r>
-        <w:t xml:space="preserve">“NYC Population by </w:t>
-      </w:r>
-      <w:proofErr w:type="spellStart"/>
-      <w:r>
-        <w:t>Neighborhood</w:t>
-      </w:r>
-      <w:proofErr w:type="spellEnd"/>
-      <w:r>
-        <w:t xml:space="preserve"> | NYC Open Data,” </w:t>
+        <w:t xml:space="preserve">“NYC Population by Neighborhood | NYC Open Data,” </w:t>
       </w:r>
       <w:r>
         <w:rPr>
@@ -624,17 +551,8 @@
     </w:p>
     <w:p>
       <w:r>
-        <w:t xml:space="preserve">“Manhattan </w:t>
-      </w:r>
-      <w:proofErr w:type="spellStart"/>
-      <w:r>
-        <w:t>Neighborhoods</w:t>
-      </w:r>
-      <w:proofErr w:type="spellEnd"/>
-      <w:r>
-        <w:t xml:space="preserve"> by Population,” </w:t>
-      </w:r>
-      <w:proofErr w:type="spellStart"/>
+        <w:t xml:space="preserve">“Manhattan Neighborhoods by Population,” </w:t>
+      </w:r>
       <w:r>
         <w:rPr>
           <w:i/>
@@ -642,7 +560,6 @@
         </w:rPr>
         <w:t>WorldAtlas</w:t>
       </w:r>
-      <w:proofErr w:type="spellEnd"/>
       <w:r>
         <w:t>, Feb. 20, 2019. https://www.worldatlas.com/articles/manhattan-neighborhoods-by-population.html (accessed Oct. 25, 2026).</w:t>
       </w:r>

</xml_diff>

<commit_message>
Added the transmission table which will act as our composite key and also changed the scenario document to explain this.
</commit_message>
<xml_diff>
--- a/scenario-for-project.docx
+++ b/scenario-for-project.docx
@@ -85,10 +85,7 @@
     </w:p>
     <w:p>
       <w:r>
-        <w:t>Furthermore</w:t>
-      </w:r>
-      <w:r>
-        <w:t xml:space="preserve">, the disease used in Operation Dark Winter was </w:t>
+        <w:t xml:space="preserve">Furthermore, the disease used in Operation Dark Winter was </w:t>
       </w:r>
       <w:r>
         <w:t>smallpox</w:t>
@@ -118,19 +115,7 @@
         <w:t>]</w:t>
       </w:r>
       <w:r>
-        <w:t xml:space="preserve">, which was eradicated, but the US and the Russian Federation hold the last remaining samples in the world, in our case we will be using the in game fictional </w:t>
-      </w:r>
-      <w:r>
-        <w:t>bioweapon</w:t>
-      </w:r>
-      <w:r>
-        <w:t xml:space="preserve"> known as the “Dollar Flu” or “Green Poison”, this is a combination of Ebola, H1N1, Smallpox and a few more diseases. Its biggest advantage over other pathogens is that it has an extremely short incubation period of approximately 3 – 7 days, and unlike other diseases, it immediately becomes infectious to others rather than staying </w:t>
-      </w:r>
-      <w:r>
-        <w:t>non-infectious</w:t>
-      </w:r>
-      <w:r>
-        <w:t xml:space="preserve"> until the incubation period is over, this combination means that people get infected very fast and die even faster, straining any form of health system.</w:t>
+        <w:t>, which was eradicated, but the US and the Russian Federation hold the last remaining samples in the world, in our case we will be using the in game fictional bioweapon known as the “Dollar Flu” or “Green Poison”, this is a combination of Ebola, H1N1, Smallpox and a few more diseases. Its biggest advantage over other pathogens is that it has an extremely short incubation period of approximately 3 – 7 days, and unlike other diseases, it immediately becomes infectious to others rather than staying non-infectious until the incubation period is over, this combination means that people get infected very fast and die even faster, straining any form of health system.</w:t>
       </w:r>
     </w:p>
     <w:p>
@@ -337,7 +322,13 @@
     </w:p>
     <w:p>
       <w:r>
-        <w:t xml:space="preserve">There will be 3 different entities represented by one table. </w:t>
+        <w:t xml:space="preserve">There will be </w:t>
+      </w:r>
+      <w:r>
+        <w:t>4</w:t>
+      </w:r>
+      <w:r>
+        <w:t xml:space="preserve"> different entities represented by one table. </w:t>
       </w:r>
     </w:p>
     <w:p>
@@ -355,7 +346,15 @@
     </w:p>
     <w:p>
       <w:r>
-        <w:t>The first table is neighbourhood which will just includes neighbourhood ID(primary key) and the name of the neighbourhood. An example being Harlem.</w:t>
+        <w:t xml:space="preserve">The first table is neighbourhood which will just </w:t>
+      </w:r>
+      <w:proofErr w:type="spellStart"/>
+      <w:r>
+        <w:t>includes</w:t>
+      </w:r>
+      <w:proofErr w:type="spellEnd"/>
+      <w:r>
+        <w:t xml:space="preserve"> neighbourhood ID(primary key) and the name of the neighbourhood. An example being Harlem.</w:t>
       </w:r>
     </w:p>
     <w:p>
@@ -364,16 +363,26 @@
           <w:u w:val="single"/>
         </w:rPr>
       </w:pPr>
+      <w:proofErr w:type="spellStart"/>
       <w:r>
         <w:rPr>
           <w:u w:val="single"/>
         </w:rPr>
         <w:t>Cityblock</w:t>
       </w:r>
-    </w:p>
-    <w:p>
-      <w:r>
-        <w:t xml:space="preserve">The second table will include the ID of the cityblock(primary key) and the neighbourhood (foreign key) the block is located in. One neighbourhood will have many city blocks. Other attributes </w:t>
+      <w:proofErr w:type="spellEnd"/>
+    </w:p>
+    <w:p>
+      <w:r>
+        <w:t xml:space="preserve">The second table will include the ID of the </w:t>
+      </w:r>
+      <w:proofErr w:type="spellStart"/>
+      <w:r>
+        <w:t>cityblock</w:t>
+      </w:r>
+      <w:proofErr w:type="spellEnd"/>
+      <w:r>
+        <w:t xml:space="preserve">(primary key) and the neighbourhood (foreign key) the block is located in. One neighbourhood will have many city blocks. Other attributes </w:t>
       </w:r>
       <w:r>
         <w:t>include one</w:t>
@@ -397,20 +406,105 @@
           <w:u w:val="single"/>
         </w:rPr>
       </w:pPr>
+      <w:proofErr w:type="spellStart"/>
       <w:r>
         <w:rPr>
           <w:u w:val="single"/>
         </w:rPr>
         <w:t>InfectionEvent</w:t>
       </w:r>
-    </w:p>
-    <w:p>
-      <w:r>
-        <w:t xml:space="preserve">This table will record the details of each individual outbreak event which occurs to spread the virus. It’s attributes will include event number(primary_key), block_ID(foreign_key), people_infected which are number of people who initially become infected at the beginning of the outbreak and a description of the outbreak and how it happened. An example being “Individuals from the original infection go about </w:t>
+      <w:proofErr w:type="spellEnd"/>
+    </w:p>
+    <w:p>
+      <w:r>
+        <w:t>This table will record the details of each individual outbreak event which occurs to spread the virus. It’s attributes will include event number(</w:t>
+      </w:r>
+      <w:proofErr w:type="spellStart"/>
+      <w:r>
+        <w:t>primary_key</w:t>
+      </w:r>
+      <w:proofErr w:type="spellEnd"/>
+      <w:r>
+        <w:t xml:space="preserve">), </w:t>
+      </w:r>
+      <w:proofErr w:type="spellStart"/>
+      <w:r>
+        <w:t>block_ID</w:t>
+      </w:r>
+      <w:proofErr w:type="spellEnd"/>
+      <w:r>
+        <w:t>(</w:t>
+      </w:r>
+      <w:proofErr w:type="spellStart"/>
+      <w:r>
+        <w:t>foreign_key</w:t>
+      </w:r>
+      <w:proofErr w:type="spellEnd"/>
+      <w:r>
+        <w:t xml:space="preserve">), </w:t>
+      </w:r>
+      <w:proofErr w:type="spellStart"/>
+      <w:r>
+        <w:t>people_infected</w:t>
+      </w:r>
+      <w:proofErr w:type="spellEnd"/>
+      <w:r>
+        <w:t xml:space="preserve"> which are number of people who initially become infected at the beginning of the outbreak and a description of the outbreak and how it happened. An example being “Individuals from the original infection go about </w:t>
       </w:r>
       <w:r>
         <w:lastRenderedPageBreak/>
-        <w:t>their day spreading the infection through airborne particles (i.e. from coughing or sneezing). “</w:t>
+        <w:t xml:space="preserve">their day spreading the infection through airborne particles (i.e. from coughing or sneezing). </w:t>
+      </w:r>
+      <w:r>
+        <w:t>“</w:t>
+      </w:r>
+    </w:p>
+    <w:p>
+      <w:pPr>
+        <w:rPr>
+          <w:u w:val="single"/>
+        </w:rPr>
+      </w:pPr>
+      <w:proofErr w:type="spellStart"/>
+      <w:r>
+        <w:rPr>
+          <w:u w:val="single"/>
+        </w:rPr>
+        <w:t>InfectionEvent</w:t>
+      </w:r>
+      <w:proofErr w:type="spellEnd"/>
+    </w:p>
+    <w:p>
+      <w:r>
+        <w:t>This table will hold the composite key and wil</w:t>
+      </w:r>
+      <w:r>
+        <w:t xml:space="preserve">l include the attributes </w:t>
+      </w:r>
+      <w:proofErr w:type="spellStart"/>
+      <w:r>
+        <w:t>Event_Number</w:t>
+      </w:r>
+      <w:proofErr w:type="spellEnd"/>
+      <w:r>
+        <w:t xml:space="preserve"> </w:t>
+      </w:r>
+      <w:r>
+        <w:t xml:space="preserve">from the </w:t>
+      </w:r>
+      <w:proofErr w:type="spellStart"/>
+      <w:r>
+        <w:t>InfectionEvent</w:t>
+      </w:r>
+      <w:proofErr w:type="spellEnd"/>
+      <w:r>
+        <w:t xml:space="preserve"> table </w:t>
+      </w:r>
+      <w:r>
+        <w:t xml:space="preserve">and </w:t>
+      </w:r>
+      <w:r>
+        <w:t>method which shows the means in which the virus spread. One event can have many methods of the disease being transmitted.</w:t>
       </w:r>
     </w:p>
     <w:p>
@@ -422,7 +516,13 @@
         <w:t xml:space="preserve">Note: </w:t>
       </w:r>
       <w:r>
-        <w:t>The infected count for the infectionevent table is different from that of the block table. The infected count for the outbreak is the base number which occurs at the beginning of that outbreak and doesn’t increase or change. The attribute for the number of people infected keeps track of the infection spreading and how that number increases. The number at the end of the simulation will be recorded onto the database.</w:t>
+        <w:t xml:space="preserve">The infected count for the </w:t>
+      </w:r>
+      <w:r>
+        <w:t>infection event</w:t>
+      </w:r>
+      <w:r>
+        <w:t xml:space="preserve"> table is different from that of the block table. The infected count for the outbreak is the base number which occurs at the beginning of that outbreak and doesn’t increase or change. The attribute for the number of people infected keeps track of the infection spreading and how that number increases. The number at the end of the simulation will be recorded onto the database.</w:t>
       </w:r>
     </w:p>
     <w:p/>
@@ -473,7 +573,15 @@
     </w:p>
     <w:p>
       <w:r>
-        <w:t xml:space="preserve">“Dark Winter | Johns Hopkins Center for Health Security,” </w:t>
+        <w:t xml:space="preserve">“Dark Winter | Johns Hopkins </w:t>
+      </w:r>
+      <w:proofErr w:type="spellStart"/>
+      <w:r>
+        <w:t>Center</w:t>
+      </w:r>
+      <w:proofErr w:type="spellEnd"/>
+      <w:r>
+        <w:t xml:space="preserve"> for Health Security,” </w:t>
       </w:r>
       <w:r>
         <w:rPr>
@@ -525,7 +633,15 @@
     </w:p>
     <w:p>
       <w:r>
-        <w:t xml:space="preserve">“NYC Population by Neighborhood | NYC Open Data,” </w:t>
+        <w:t xml:space="preserve">“NYC Population by </w:t>
+      </w:r>
+      <w:proofErr w:type="spellStart"/>
+      <w:r>
+        <w:t>Neighborhood</w:t>
+      </w:r>
+      <w:proofErr w:type="spellEnd"/>
+      <w:r>
+        <w:t xml:space="preserve"> | NYC Open Data,” </w:t>
       </w:r>
       <w:r>
         <w:rPr>
@@ -551,8 +667,17 @@
     </w:p>
     <w:p>
       <w:r>
-        <w:t xml:space="preserve">“Manhattan Neighborhoods by Population,” </w:t>
-      </w:r>
+        <w:t xml:space="preserve">“Manhattan </w:t>
+      </w:r>
+      <w:proofErr w:type="spellStart"/>
+      <w:r>
+        <w:t>Neighborhoods</w:t>
+      </w:r>
+      <w:proofErr w:type="spellEnd"/>
+      <w:r>
+        <w:t xml:space="preserve"> by Population,” </w:t>
+      </w:r>
+      <w:proofErr w:type="spellStart"/>
       <w:r>
         <w:rPr>
           <w:i/>
@@ -560,6 +685,7 @@
         </w:rPr>
         <w:t>WorldAtlas</w:t>
       </w:r>
+      <w:proofErr w:type="spellEnd"/>
       <w:r>
         <w:t>, Feb. 20, 2019. https://www.worldatlas.com/articles/manhattan-neighborhoods-by-population.html (accessed Oct. 25, 2026).</w:t>
       </w:r>
@@ -575,17 +701,12 @@
     </w:p>
     <w:p>
       <w:r>
-        <w:t>[</w:t>
-      </w:r>
-      <w:r>
-        <w:t>6</w:t>
-      </w:r>
-      <w:r>
-        <w:t xml:space="preserve">] </w:t>
-      </w:r>
-    </w:p>
-    <w:p>
-      <w:r>
+        <w:t xml:space="preserve">[6] </w:t>
+      </w:r>
+    </w:p>
+    <w:p>
+      <w:r>
+        <w:lastRenderedPageBreak/>
         <w:t xml:space="preserve">Green poison | the division wiki | fandom, https://thedivision.fandom.com/wiki/Green_Poison </w:t>
       </w:r>
     </w:p>
@@ -1214,6 +1335,7 @@
   <w:style w:type="character" w:default="1" w:styleId="DefaultParagraphFont">
     <w:name w:val="Default Paragraph Font"/>
     <w:uiPriority w:val="1"/>
+    <w:semiHidden/>
     <w:unhideWhenUsed/>
   </w:style>
   <w:style w:type="table" w:default="1" w:styleId="TableNormal">

</xml_diff>